<commit_message>
Pushing updated local copy of Module 1.2 with GitHub Screenshot
</commit_message>
<xml_diff>
--- a/module-1/morrow_assignment1_2.docx
+++ b/module-1/morrow_assignment1_2.docx
@@ -60,9 +60,48 @@
         <w:t>Screenshot of your GitHub repository</w:t>
       </w:r>
     </w:p>
-    <w:p/>
-    <w:p/>
-    <w:p/>
+    <w:p>
+      <w:r>
+        <w:rPr>
+          <w:noProof/>
+        </w:rPr>
+        <w:drawing>
+          <wp:inline distT="0" distB="0" distL="0" distR="0" wp14:anchorId="4DAFC97E" wp14:editId="620B87FB">
+            <wp:extent cx="3371850" cy="3514853"/>
+            <wp:effectExtent l="0" t="0" r="0" b="9525"/>
+            <wp:docPr id="109296276" name="Picture 1"/>
+            <wp:cNvGraphicFramePr>
+              <a:graphicFrameLocks xmlns:a="http://schemas.openxmlformats.org/drawingml/2006/main" noChangeAspect="1"/>
+            </wp:cNvGraphicFramePr>
+            <a:graphic xmlns:a="http://schemas.openxmlformats.org/drawingml/2006/main">
+              <a:graphicData uri="http://schemas.openxmlformats.org/drawingml/2006/picture">
+                <pic:pic xmlns:pic="http://schemas.openxmlformats.org/drawingml/2006/picture">
+                  <pic:nvPicPr>
+                    <pic:cNvPr id="109296276" name=""/>
+                    <pic:cNvPicPr/>
+                  </pic:nvPicPr>
+                  <pic:blipFill>
+                    <a:blip r:embed="rId6"/>
+                    <a:stretch>
+                      <a:fillRect/>
+                    </a:stretch>
+                  </pic:blipFill>
+                  <pic:spPr>
+                    <a:xfrm>
+                      <a:off x="0" y="0"/>
+                      <a:ext cx="3377974" cy="3521237"/>
+                    </a:xfrm>
+                    <a:prstGeom prst="rect">
+                      <a:avLst/>
+                    </a:prstGeom>
+                  </pic:spPr>
+                </pic:pic>
+              </a:graphicData>
+            </a:graphic>
+          </wp:inline>
+        </w:drawing>
+      </w:r>
+    </w:p>
     <w:p>
       <w:pPr>
         <w:rPr>
@@ -84,8 +123,8 @@
           <w:noProof/>
         </w:rPr>
         <w:drawing>
-          <wp:inline distT="0" distB="0" distL="0" distR="0" wp14:anchorId="540E0745" wp14:editId="7E22E0BF">
-            <wp:extent cx="5943600" cy="2300605"/>
+          <wp:inline distT="0" distB="0" distL="0" distR="0" wp14:anchorId="540E0745" wp14:editId="7ADF7458">
+            <wp:extent cx="5205366" cy="2014855"/>
             <wp:effectExtent l="0" t="0" r="0" b="4445"/>
             <wp:docPr id="1270016570" name="Picture 1"/>
             <wp:cNvGraphicFramePr>
@@ -99,7 +138,7 @@
                     <pic:cNvPicPr/>
                   </pic:nvPicPr>
                   <pic:blipFill>
-                    <a:blip r:embed="rId6"/>
+                    <a:blip r:embed="rId7"/>
                     <a:stretch>
                       <a:fillRect/>
                     </a:stretch>
@@ -107,7 +146,7 @@
                   <pic:spPr>
                     <a:xfrm>
                       <a:off x="0" y="0"/>
-                      <a:ext cx="5943600" cy="2300605"/>
+                      <a:ext cx="5217343" cy="2019491"/>
                     </a:xfrm>
                     <a:prstGeom prst="rect">
                       <a:avLst/>
@@ -890,6 +929,7 @@
   <w:style w:type="character" w:default="1" w:styleId="DefaultParagraphFont">
     <w:name w:val="Default Paragraph Font"/>
     <w:uiPriority w:val="1"/>
+    <w:semiHidden/>
     <w:unhideWhenUsed/>
   </w:style>
   <w:style w:type="table" w:default="1" w:styleId="TableNormal">

</xml_diff>